<commit_message>
feat: implement QR 0-touch reporting, AHP scientific matrix, benchmark FIFO comparison, and predictive maintenance
</commit_message>
<xml_diff>
--- a/Mo_ta_cac_luong_chinh_he_thong_SIMPS.docx
+++ b/Mo_ta_cac_luong_chinh_he_thong_SIMPS.docx
@@ -1315,7 +1315,12 @@
           <w:color w:val="1E3A8A"/>
           <w:sz w:val="28"/>
         </w:rPr>
-        <w:t>CHƯƠNG 5: ĐÁNH GIÁ TÍNH MỚI, TÍNH THỰC TIỄN &amp; HIỆU QUẢ CỦA ĐỀ TÀI</w:t>
+        <w:t>CHƯƠNG 4: CƠ SỞ KHOA HỌC &amp; PHƯƠNG PHÁP PHÂN TÍCH THỨ BẬC AHP</w:t>
+      </w:r>
+    </w:p>
+    <w:p>
+      <w:r>
+        <w:t>Nhằm đảm bảo tính khách quan và khoa học khi xác lập bộ 5 trọng số (w1, w2, w3, w4, w5), đề tài đã ứng dụng Phương pháp Phân tích Thứ bậc AHP (Analytic Hierarchy Process) do Giáo sư Thomas L. Saaty đề xuất. Đây là công cụ toán học tiêu chuẩn toàn cầu để giải quyết các bài toán ra quyết định đa tiêu chí (MCDM).</w:t>
       </w:r>
     </w:p>
     <w:p>
@@ -1330,16 +1335,1498 @@
           <w:color w:val="2563EB"/>
           <w:sz w:val="24"/>
         </w:rPr>
-        <w:t>5.1. Tính mới và sáng tạo</w:t>
+        <w:t>4.1. Ma trận so sánh cặp giữa các tiêu chí (Pairwise Comparison Matrix)</w:t>
       </w:r>
     </w:p>
     <w:p>
       <w:r>
-        <w:t>1. Ứng dụng Thuật toán Đa tiêu chí Tuyến tính kết hợp Ghi đè An toàn (Safety Override): Thay vì sắp xếp sự cố theo thứ tự thời gian nộp đơn (FIFO) hoặc hoàn toàn theo cảm tính, SIMPS là hệ thống đầu tiên trong nhà trường lượng hóa chính xác mức độ khẩn cấp dựa trên 5 yếu tố cốt lõi (S, I, R, T, E).</w:t>
+        <w:t>Dựa trên khảo sát thực tế tại Trường THPT Ô Môn và tham vấn Ban Giám hiệu cùng Tổ kỹ thuật, mức độ ưu tiên giữa các tiêu chí được xác lập theo thang điểm 1-9 của Saaty:</w:t>
+      </w:r>
+    </w:p>
+    <w:tbl>
+      <w:tblPr>
+        <w:tblW w:type="auto" w:w="0"/>
+        <w:jc w:val="center"/>
+        <w:tblLook w:firstColumn="1" w:firstRow="1" w:lastColumn="0" w:lastRow="0" w:noHBand="0" w:noVBand="1" w:val="04A0"/>
+      </w:tblPr>
+      <w:tblGrid>
+        <w:gridCol w:w="1378"/>
+        <w:gridCol w:w="1378"/>
+        <w:gridCol w:w="1378"/>
+        <w:gridCol w:w="1378"/>
+        <w:gridCol w:w="1378"/>
+        <w:gridCol w:w="1378"/>
+        <w:gridCol w:w="1378"/>
+      </w:tblGrid>
+      <w:tr>
+        <w:tc>
+          <w:tcPr>
+            <w:tcW w:type="dxa" w:w="1378"/>
+            <w:shd w:fill="1E3A8A"/>
+            <w:tcMar>
+              <w:top w:w="100" w:type="dxa"/>
+              <w:bottom w:w="100" w:type="dxa"/>
+              <w:left w:w="100" w:type="dxa"/>
+              <w:right w:w="100" w:type="dxa"/>
+            </w:tcMar>
+          </w:tcPr>
+          <w:p>
+            <w:pPr>
+              <w:jc w:val="center"/>
+            </w:pPr>
+            <w:r>
+              <w:rPr>
+                <w:b/>
+                <w:color w:val="FFFFFF"/>
+                <w:sz w:val="19"/>
+              </w:rPr>
+              <w:t>Tiêu chí</w:t>
+            </w:r>
+          </w:p>
+        </w:tc>
+        <w:tc>
+          <w:tcPr>
+            <w:tcW w:type="dxa" w:w="1378"/>
+            <w:shd w:fill="1E3A8A"/>
+            <w:tcMar>
+              <w:top w:w="100" w:type="dxa"/>
+              <w:bottom w:w="100" w:type="dxa"/>
+              <w:left w:w="100" w:type="dxa"/>
+              <w:right w:w="100" w:type="dxa"/>
+            </w:tcMar>
+          </w:tcPr>
+          <w:p>
+            <w:pPr>
+              <w:jc w:val="center"/>
+            </w:pPr>
+            <w:r>
+              <w:rPr>
+                <w:b/>
+                <w:color w:val="FFFFFF"/>
+                <w:sz w:val="19"/>
+              </w:rPr>
+              <w:t>S (Nghiêm trọng)</w:t>
+            </w:r>
+          </w:p>
+        </w:tc>
+        <w:tc>
+          <w:tcPr>
+            <w:tcW w:type="dxa" w:w="1378"/>
+            <w:shd w:fill="1E3A8A"/>
+            <w:tcMar>
+              <w:top w:w="100" w:type="dxa"/>
+              <w:bottom w:w="100" w:type="dxa"/>
+              <w:left w:w="100" w:type="dxa"/>
+              <w:right w:w="100" w:type="dxa"/>
+            </w:tcMar>
+          </w:tcPr>
+          <w:p>
+            <w:pPr>
+              <w:jc w:val="center"/>
+            </w:pPr>
+            <w:r>
+              <w:rPr>
+                <w:b/>
+                <w:color w:val="FFFFFF"/>
+                <w:sz w:val="19"/>
+              </w:rPr>
+              <w:t>I (Số người)</w:t>
+            </w:r>
+          </w:p>
+        </w:tc>
+        <w:tc>
+          <w:tcPr>
+            <w:tcW w:type="dxa" w:w="1378"/>
+            <w:shd w:fill="1E3A8A"/>
+            <w:tcMar>
+              <w:top w:w="100" w:type="dxa"/>
+              <w:bottom w:w="100" w:type="dxa"/>
+              <w:left w:w="100" w:type="dxa"/>
+              <w:right w:w="100" w:type="dxa"/>
+            </w:tcMar>
+          </w:tcPr>
+          <w:p>
+            <w:pPr>
+              <w:jc w:val="center"/>
+            </w:pPr>
+            <w:r>
+              <w:rPr>
+                <w:b/>
+                <w:color w:val="FFFFFF"/>
+                <w:sz w:val="19"/>
+              </w:rPr>
+              <w:t>R (Rủi ro vị trí)</w:t>
+            </w:r>
+          </w:p>
+        </w:tc>
+        <w:tc>
+          <w:tcPr>
+            <w:tcW w:type="dxa" w:w="1378"/>
+            <w:shd w:fill="1E3A8A"/>
+            <w:tcMar>
+              <w:top w:w="100" w:type="dxa"/>
+              <w:bottom w:w="100" w:type="dxa"/>
+              <w:left w:w="100" w:type="dxa"/>
+              <w:right w:w="100" w:type="dxa"/>
+            </w:tcMar>
+          </w:tcPr>
+          <w:p>
+            <w:pPr>
+              <w:jc w:val="center"/>
+            </w:pPr>
+            <w:r>
+              <w:rPr>
+                <w:b/>
+                <w:color w:val="FFFFFF"/>
+                <w:sz w:val="19"/>
+              </w:rPr>
+              <w:t>T (Thời gian chờ)</w:t>
+            </w:r>
+          </w:p>
+        </w:tc>
+        <w:tc>
+          <w:tcPr>
+            <w:tcW w:type="dxa" w:w="1378"/>
+            <w:shd w:fill="1E3A8A"/>
+            <w:tcMar>
+              <w:top w:w="100" w:type="dxa"/>
+              <w:bottom w:w="100" w:type="dxa"/>
+              <w:left w:w="100" w:type="dxa"/>
+              <w:right w:w="100" w:type="dxa"/>
+            </w:tcMar>
+          </w:tcPr>
+          <w:p>
+            <w:pPr>
+              <w:jc w:val="center"/>
+            </w:pPr>
+            <w:r>
+              <w:rPr>
+                <w:b/>
+                <w:color w:val="FFFFFF"/>
+                <w:sz w:val="19"/>
+              </w:rPr>
+              <w:t>E (Tác động học)</w:t>
+            </w:r>
+          </w:p>
+        </w:tc>
+        <w:tc>
+          <w:tcPr>
+            <w:tcW w:type="dxa" w:w="1378"/>
+            <w:shd w:fill="1E3A8A"/>
+            <w:tcMar>
+              <w:top w:w="100" w:type="dxa"/>
+              <w:bottom w:w="100" w:type="dxa"/>
+              <w:left w:w="100" w:type="dxa"/>
+              <w:right w:w="100" w:type="dxa"/>
+            </w:tcMar>
+          </w:tcPr>
+          <w:p>
+            <w:pPr>
+              <w:jc w:val="center"/>
+            </w:pPr>
+            <w:r>
+              <w:rPr>
+                <w:b/>
+                <w:color w:val="FFFFFF"/>
+                <w:sz w:val="19"/>
+              </w:rPr>
+              <w:t>Trọng số (w)</w:t>
+            </w:r>
+          </w:p>
+        </w:tc>
+      </w:tr>
+      <w:tr>
+        <w:tc>
+          <w:tcPr>
+            <w:tcW w:type="dxa" w:w="1378"/>
+            <w:shd w:fill="FFFFFF"/>
+            <w:tcMar>
+              <w:top w:w="80" w:type="dxa"/>
+              <w:bottom w:w="80" w:type="dxa"/>
+              <w:left w:w="100" w:type="dxa"/>
+              <w:right w:w="100" w:type="dxa"/>
+            </w:tcMar>
+          </w:tcPr>
+          <w:p>
+            <w:pPr>
+              <w:jc w:val="center"/>
+            </w:pPr>
+            <w:r>
+              <w:rPr>
+                <w:b/>
+              </w:rPr>
+              <w:t>S</w:t>
+            </w:r>
+          </w:p>
+        </w:tc>
+        <w:tc>
+          <w:tcPr>
+            <w:tcW w:type="dxa" w:w="1378"/>
+            <w:shd w:fill="FFFFFF"/>
+            <w:tcMar>
+              <w:top w:w="80" w:type="dxa"/>
+              <w:bottom w:w="80" w:type="dxa"/>
+              <w:left w:w="100" w:type="dxa"/>
+              <w:right w:w="100" w:type="dxa"/>
+            </w:tcMar>
+          </w:tcPr>
+          <w:p>
+            <w:pPr>
+              <w:jc w:val="center"/>
+            </w:pPr>
+            <w:r>
+              <w:t>1.00</w:t>
+            </w:r>
+          </w:p>
+        </w:tc>
+        <w:tc>
+          <w:tcPr>
+            <w:tcW w:type="dxa" w:w="1378"/>
+            <w:shd w:fill="FFFFFF"/>
+            <w:tcMar>
+              <w:top w:w="80" w:type="dxa"/>
+              <w:bottom w:w="80" w:type="dxa"/>
+              <w:left w:w="100" w:type="dxa"/>
+              <w:right w:w="100" w:type="dxa"/>
+            </w:tcMar>
+          </w:tcPr>
+          <w:p>
+            <w:pPr>
+              <w:jc w:val="center"/>
+            </w:pPr>
+            <w:r>
+              <w:t>1.50</w:t>
+            </w:r>
+          </w:p>
+        </w:tc>
+        <w:tc>
+          <w:tcPr>
+            <w:tcW w:type="dxa" w:w="1378"/>
+            <w:shd w:fill="FFFFFF"/>
+            <w:tcMar>
+              <w:top w:w="80" w:type="dxa"/>
+              <w:bottom w:w="80" w:type="dxa"/>
+              <w:left w:w="100" w:type="dxa"/>
+              <w:right w:w="100" w:type="dxa"/>
+            </w:tcMar>
+          </w:tcPr>
+          <w:p>
+            <w:pPr>
+              <w:jc w:val="center"/>
+            </w:pPr>
+            <w:r>
+              <w:t>1.50</w:t>
+            </w:r>
+          </w:p>
+        </w:tc>
+        <w:tc>
+          <w:tcPr>
+            <w:tcW w:type="dxa" w:w="1378"/>
+            <w:shd w:fill="FFFFFF"/>
+            <w:tcMar>
+              <w:top w:w="80" w:type="dxa"/>
+              <w:bottom w:w="80" w:type="dxa"/>
+              <w:left w:w="100" w:type="dxa"/>
+              <w:right w:w="100" w:type="dxa"/>
+            </w:tcMar>
+          </w:tcPr>
+          <w:p>
+            <w:pPr>
+              <w:jc w:val="center"/>
+            </w:pPr>
+            <w:r>
+              <w:t>2.00</w:t>
+            </w:r>
+          </w:p>
+        </w:tc>
+        <w:tc>
+          <w:tcPr>
+            <w:tcW w:type="dxa" w:w="1378"/>
+            <w:shd w:fill="FFFFFF"/>
+            <w:tcMar>
+              <w:top w:w="80" w:type="dxa"/>
+              <w:bottom w:w="80" w:type="dxa"/>
+              <w:left w:w="100" w:type="dxa"/>
+              <w:right w:w="100" w:type="dxa"/>
+            </w:tcMar>
+          </w:tcPr>
+          <w:p>
+            <w:pPr>
+              <w:jc w:val="center"/>
+            </w:pPr>
+            <w:r>
+              <w:t>2.00</w:t>
+            </w:r>
+          </w:p>
+        </w:tc>
+        <w:tc>
+          <w:tcPr>
+            <w:tcW w:type="dxa" w:w="1378"/>
+            <w:shd w:fill="FFFFFF"/>
+            <w:tcMar>
+              <w:top w:w="80" w:type="dxa"/>
+              <w:bottom w:w="80" w:type="dxa"/>
+              <w:left w:w="100" w:type="dxa"/>
+              <w:right w:w="100" w:type="dxa"/>
+            </w:tcMar>
+          </w:tcPr>
+          <w:p>
+            <w:pPr>
+              <w:jc w:val="center"/>
+            </w:pPr>
+            <w:r>
+              <w:rPr>
+                <w:b/>
+              </w:rPr>
+              <w:t>0.30 (30%)</w:t>
+            </w:r>
+          </w:p>
+        </w:tc>
+      </w:tr>
+      <w:tr>
+        <w:tc>
+          <w:tcPr>
+            <w:tcW w:type="dxa" w:w="1378"/>
+            <w:shd w:fill="F8FAFC"/>
+            <w:tcMar>
+              <w:top w:w="80" w:type="dxa"/>
+              <w:bottom w:w="80" w:type="dxa"/>
+              <w:left w:w="100" w:type="dxa"/>
+              <w:right w:w="100" w:type="dxa"/>
+            </w:tcMar>
+          </w:tcPr>
+          <w:p>
+            <w:pPr>
+              <w:jc w:val="center"/>
+            </w:pPr>
+            <w:r>
+              <w:rPr>
+                <w:b/>
+              </w:rPr>
+              <w:t>I</w:t>
+            </w:r>
+          </w:p>
+        </w:tc>
+        <w:tc>
+          <w:tcPr>
+            <w:tcW w:type="dxa" w:w="1378"/>
+            <w:shd w:fill="F8FAFC"/>
+            <w:tcMar>
+              <w:top w:w="80" w:type="dxa"/>
+              <w:bottom w:w="80" w:type="dxa"/>
+              <w:left w:w="100" w:type="dxa"/>
+              <w:right w:w="100" w:type="dxa"/>
+            </w:tcMar>
+          </w:tcPr>
+          <w:p>
+            <w:pPr>
+              <w:jc w:val="center"/>
+            </w:pPr>
+            <w:r>
+              <w:t>0.67</w:t>
+            </w:r>
+          </w:p>
+        </w:tc>
+        <w:tc>
+          <w:tcPr>
+            <w:tcW w:type="dxa" w:w="1378"/>
+            <w:shd w:fill="F8FAFC"/>
+            <w:tcMar>
+              <w:top w:w="80" w:type="dxa"/>
+              <w:bottom w:w="80" w:type="dxa"/>
+              <w:left w:w="100" w:type="dxa"/>
+              <w:right w:w="100" w:type="dxa"/>
+            </w:tcMar>
+          </w:tcPr>
+          <w:p>
+            <w:pPr>
+              <w:jc w:val="center"/>
+            </w:pPr>
+            <w:r>
+              <w:t>1.00</w:t>
+            </w:r>
+          </w:p>
+        </w:tc>
+        <w:tc>
+          <w:tcPr>
+            <w:tcW w:type="dxa" w:w="1378"/>
+            <w:shd w:fill="F8FAFC"/>
+            <w:tcMar>
+              <w:top w:w="80" w:type="dxa"/>
+              <w:bottom w:w="80" w:type="dxa"/>
+              <w:left w:w="100" w:type="dxa"/>
+              <w:right w:w="100" w:type="dxa"/>
+            </w:tcMar>
+          </w:tcPr>
+          <w:p>
+            <w:pPr>
+              <w:jc w:val="center"/>
+            </w:pPr>
+            <w:r>
+              <w:t>1.00</w:t>
+            </w:r>
+          </w:p>
+        </w:tc>
+        <w:tc>
+          <w:tcPr>
+            <w:tcW w:type="dxa" w:w="1378"/>
+            <w:shd w:fill="F8FAFC"/>
+            <w:tcMar>
+              <w:top w:w="80" w:type="dxa"/>
+              <w:bottom w:w="80" w:type="dxa"/>
+              <w:left w:w="100" w:type="dxa"/>
+              <w:right w:w="100" w:type="dxa"/>
+            </w:tcMar>
+          </w:tcPr>
+          <w:p>
+            <w:pPr>
+              <w:jc w:val="center"/>
+            </w:pPr>
+            <w:r>
+              <w:t>1.33</w:t>
+            </w:r>
+          </w:p>
+        </w:tc>
+        <w:tc>
+          <w:tcPr>
+            <w:tcW w:type="dxa" w:w="1378"/>
+            <w:shd w:fill="F8FAFC"/>
+            <w:tcMar>
+              <w:top w:w="80" w:type="dxa"/>
+              <w:bottom w:w="80" w:type="dxa"/>
+              <w:left w:w="100" w:type="dxa"/>
+              <w:right w:w="100" w:type="dxa"/>
+            </w:tcMar>
+          </w:tcPr>
+          <w:p>
+            <w:pPr>
+              <w:jc w:val="center"/>
+            </w:pPr>
+            <w:r>
+              <w:t>1.33</w:t>
+            </w:r>
+          </w:p>
+        </w:tc>
+        <w:tc>
+          <w:tcPr>
+            <w:tcW w:type="dxa" w:w="1378"/>
+            <w:shd w:fill="F8FAFC"/>
+            <w:tcMar>
+              <w:top w:w="80" w:type="dxa"/>
+              <w:bottom w:w="80" w:type="dxa"/>
+              <w:left w:w="100" w:type="dxa"/>
+              <w:right w:w="100" w:type="dxa"/>
+            </w:tcMar>
+          </w:tcPr>
+          <w:p>
+            <w:pPr>
+              <w:jc w:val="center"/>
+            </w:pPr>
+            <w:r>
+              <w:rPr>
+                <w:b/>
+              </w:rPr>
+              <w:t>0.20 (20%)</w:t>
+            </w:r>
+          </w:p>
+        </w:tc>
+      </w:tr>
+      <w:tr>
+        <w:tc>
+          <w:tcPr>
+            <w:tcW w:type="dxa" w:w="1378"/>
+            <w:shd w:fill="FFFFFF"/>
+            <w:tcMar>
+              <w:top w:w="80" w:type="dxa"/>
+              <w:bottom w:w="80" w:type="dxa"/>
+              <w:left w:w="100" w:type="dxa"/>
+              <w:right w:w="100" w:type="dxa"/>
+            </w:tcMar>
+          </w:tcPr>
+          <w:p>
+            <w:pPr>
+              <w:jc w:val="center"/>
+            </w:pPr>
+            <w:r>
+              <w:rPr>
+                <w:b/>
+              </w:rPr>
+              <w:t>R</w:t>
+            </w:r>
+          </w:p>
+        </w:tc>
+        <w:tc>
+          <w:tcPr>
+            <w:tcW w:type="dxa" w:w="1378"/>
+            <w:shd w:fill="FFFFFF"/>
+            <w:tcMar>
+              <w:top w:w="80" w:type="dxa"/>
+              <w:bottom w:w="80" w:type="dxa"/>
+              <w:left w:w="100" w:type="dxa"/>
+              <w:right w:w="100" w:type="dxa"/>
+            </w:tcMar>
+          </w:tcPr>
+          <w:p>
+            <w:pPr>
+              <w:jc w:val="center"/>
+            </w:pPr>
+            <w:r>
+              <w:t>0.67</w:t>
+            </w:r>
+          </w:p>
+        </w:tc>
+        <w:tc>
+          <w:tcPr>
+            <w:tcW w:type="dxa" w:w="1378"/>
+            <w:shd w:fill="FFFFFF"/>
+            <w:tcMar>
+              <w:top w:w="80" w:type="dxa"/>
+              <w:bottom w:w="80" w:type="dxa"/>
+              <w:left w:w="100" w:type="dxa"/>
+              <w:right w:w="100" w:type="dxa"/>
+            </w:tcMar>
+          </w:tcPr>
+          <w:p>
+            <w:pPr>
+              <w:jc w:val="center"/>
+            </w:pPr>
+            <w:r>
+              <w:t>1.00</w:t>
+            </w:r>
+          </w:p>
+        </w:tc>
+        <w:tc>
+          <w:tcPr>
+            <w:tcW w:type="dxa" w:w="1378"/>
+            <w:shd w:fill="FFFFFF"/>
+            <w:tcMar>
+              <w:top w:w="80" w:type="dxa"/>
+              <w:bottom w:w="80" w:type="dxa"/>
+              <w:left w:w="100" w:type="dxa"/>
+              <w:right w:w="100" w:type="dxa"/>
+            </w:tcMar>
+          </w:tcPr>
+          <w:p>
+            <w:pPr>
+              <w:jc w:val="center"/>
+            </w:pPr>
+            <w:r>
+              <w:t>1.00</w:t>
+            </w:r>
+          </w:p>
+        </w:tc>
+        <w:tc>
+          <w:tcPr>
+            <w:tcW w:type="dxa" w:w="1378"/>
+            <w:shd w:fill="FFFFFF"/>
+            <w:tcMar>
+              <w:top w:w="80" w:type="dxa"/>
+              <w:bottom w:w="80" w:type="dxa"/>
+              <w:left w:w="100" w:type="dxa"/>
+              <w:right w:w="100" w:type="dxa"/>
+            </w:tcMar>
+          </w:tcPr>
+          <w:p>
+            <w:pPr>
+              <w:jc w:val="center"/>
+            </w:pPr>
+            <w:r>
+              <w:t>1.33</w:t>
+            </w:r>
+          </w:p>
+        </w:tc>
+        <w:tc>
+          <w:tcPr>
+            <w:tcW w:type="dxa" w:w="1378"/>
+            <w:shd w:fill="FFFFFF"/>
+            <w:tcMar>
+              <w:top w:w="80" w:type="dxa"/>
+              <w:bottom w:w="80" w:type="dxa"/>
+              <w:left w:w="100" w:type="dxa"/>
+              <w:right w:w="100" w:type="dxa"/>
+            </w:tcMar>
+          </w:tcPr>
+          <w:p>
+            <w:pPr>
+              <w:jc w:val="center"/>
+            </w:pPr>
+            <w:r>
+              <w:t>1.33</w:t>
+            </w:r>
+          </w:p>
+        </w:tc>
+        <w:tc>
+          <w:tcPr>
+            <w:tcW w:type="dxa" w:w="1378"/>
+            <w:shd w:fill="FFFFFF"/>
+            <w:tcMar>
+              <w:top w:w="80" w:type="dxa"/>
+              <w:bottom w:w="80" w:type="dxa"/>
+              <w:left w:w="100" w:type="dxa"/>
+              <w:right w:w="100" w:type="dxa"/>
+            </w:tcMar>
+          </w:tcPr>
+          <w:p>
+            <w:pPr>
+              <w:jc w:val="center"/>
+            </w:pPr>
+            <w:r>
+              <w:rPr>
+                <w:b/>
+              </w:rPr>
+              <w:t>0.20 (20%)</w:t>
+            </w:r>
+          </w:p>
+        </w:tc>
+      </w:tr>
+      <w:tr>
+        <w:tc>
+          <w:tcPr>
+            <w:tcW w:type="dxa" w:w="1378"/>
+            <w:shd w:fill="F8FAFC"/>
+            <w:tcMar>
+              <w:top w:w="80" w:type="dxa"/>
+              <w:bottom w:w="80" w:type="dxa"/>
+              <w:left w:w="100" w:type="dxa"/>
+              <w:right w:w="100" w:type="dxa"/>
+            </w:tcMar>
+          </w:tcPr>
+          <w:p>
+            <w:pPr>
+              <w:jc w:val="center"/>
+            </w:pPr>
+            <w:r>
+              <w:rPr>
+                <w:b/>
+              </w:rPr>
+              <w:t>T</w:t>
+            </w:r>
+          </w:p>
+        </w:tc>
+        <w:tc>
+          <w:tcPr>
+            <w:tcW w:type="dxa" w:w="1378"/>
+            <w:shd w:fill="F8FAFC"/>
+            <w:tcMar>
+              <w:top w:w="80" w:type="dxa"/>
+              <w:bottom w:w="80" w:type="dxa"/>
+              <w:left w:w="100" w:type="dxa"/>
+              <w:right w:w="100" w:type="dxa"/>
+            </w:tcMar>
+          </w:tcPr>
+          <w:p>
+            <w:pPr>
+              <w:jc w:val="center"/>
+            </w:pPr>
+            <w:r>
+              <w:t>0.50</w:t>
+            </w:r>
+          </w:p>
+        </w:tc>
+        <w:tc>
+          <w:tcPr>
+            <w:tcW w:type="dxa" w:w="1378"/>
+            <w:shd w:fill="F8FAFC"/>
+            <w:tcMar>
+              <w:top w:w="80" w:type="dxa"/>
+              <w:bottom w:w="80" w:type="dxa"/>
+              <w:left w:w="100" w:type="dxa"/>
+              <w:right w:w="100" w:type="dxa"/>
+            </w:tcMar>
+          </w:tcPr>
+          <w:p>
+            <w:pPr>
+              <w:jc w:val="center"/>
+            </w:pPr>
+            <w:r>
+              <w:t>0.75</w:t>
+            </w:r>
+          </w:p>
+        </w:tc>
+        <w:tc>
+          <w:tcPr>
+            <w:tcW w:type="dxa" w:w="1378"/>
+            <w:shd w:fill="F8FAFC"/>
+            <w:tcMar>
+              <w:top w:w="80" w:type="dxa"/>
+              <w:bottom w:w="80" w:type="dxa"/>
+              <w:left w:w="100" w:type="dxa"/>
+              <w:right w:w="100" w:type="dxa"/>
+            </w:tcMar>
+          </w:tcPr>
+          <w:p>
+            <w:pPr>
+              <w:jc w:val="center"/>
+            </w:pPr>
+            <w:r>
+              <w:t>0.75</w:t>
+            </w:r>
+          </w:p>
+        </w:tc>
+        <w:tc>
+          <w:tcPr>
+            <w:tcW w:type="dxa" w:w="1378"/>
+            <w:shd w:fill="F8FAFC"/>
+            <w:tcMar>
+              <w:top w:w="80" w:type="dxa"/>
+              <w:bottom w:w="80" w:type="dxa"/>
+              <w:left w:w="100" w:type="dxa"/>
+              <w:right w:w="100" w:type="dxa"/>
+            </w:tcMar>
+          </w:tcPr>
+          <w:p>
+            <w:pPr>
+              <w:jc w:val="center"/>
+            </w:pPr>
+            <w:r>
+              <w:t>1.00</w:t>
+            </w:r>
+          </w:p>
+        </w:tc>
+        <w:tc>
+          <w:tcPr>
+            <w:tcW w:type="dxa" w:w="1378"/>
+            <w:shd w:fill="F8FAFC"/>
+            <w:tcMar>
+              <w:top w:w="80" w:type="dxa"/>
+              <w:bottom w:w="80" w:type="dxa"/>
+              <w:left w:w="100" w:type="dxa"/>
+              <w:right w:w="100" w:type="dxa"/>
+            </w:tcMar>
+          </w:tcPr>
+          <w:p>
+            <w:pPr>
+              <w:jc w:val="center"/>
+            </w:pPr>
+            <w:r>
+              <w:t>1.00</w:t>
+            </w:r>
+          </w:p>
+        </w:tc>
+        <w:tc>
+          <w:tcPr>
+            <w:tcW w:type="dxa" w:w="1378"/>
+            <w:shd w:fill="F8FAFC"/>
+            <w:tcMar>
+              <w:top w:w="80" w:type="dxa"/>
+              <w:bottom w:w="80" w:type="dxa"/>
+              <w:left w:w="100" w:type="dxa"/>
+              <w:right w:w="100" w:type="dxa"/>
+            </w:tcMar>
+          </w:tcPr>
+          <w:p>
+            <w:pPr>
+              <w:jc w:val="center"/>
+            </w:pPr>
+            <w:r>
+              <w:rPr>
+                <w:b/>
+              </w:rPr>
+              <w:t>0.15 (15%)</w:t>
+            </w:r>
+          </w:p>
+        </w:tc>
+      </w:tr>
+      <w:tr>
+        <w:tc>
+          <w:tcPr>
+            <w:tcW w:type="dxa" w:w="1378"/>
+            <w:shd w:fill="FFFFFF"/>
+            <w:tcMar>
+              <w:top w:w="80" w:type="dxa"/>
+              <w:bottom w:w="80" w:type="dxa"/>
+              <w:left w:w="100" w:type="dxa"/>
+              <w:right w:w="100" w:type="dxa"/>
+            </w:tcMar>
+          </w:tcPr>
+          <w:p>
+            <w:pPr>
+              <w:jc w:val="center"/>
+            </w:pPr>
+            <w:r>
+              <w:rPr>
+                <w:b/>
+              </w:rPr>
+              <w:t>E</w:t>
+            </w:r>
+          </w:p>
+        </w:tc>
+        <w:tc>
+          <w:tcPr>
+            <w:tcW w:type="dxa" w:w="1378"/>
+            <w:shd w:fill="FFFFFF"/>
+            <w:tcMar>
+              <w:top w:w="80" w:type="dxa"/>
+              <w:bottom w:w="80" w:type="dxa"/>
+              <w:left w:w="100" w:type="dxa"/>
+              <w:right w:w="100" w:type="dxa"/>
+            </w:tcMar>
+          </w:tcPr>
+          <w:p>
+            <w:pPr>
+              <w:jc w:val="center"/>
+            </w:pPr>
+            <w:r>
+              <w:t>0.50</w:t>
+            </w:r>
+          </w:p>
+        </w:tc>
+        <w:tc>
+          <w:tcPr>
+            <w:tcW w:type="dxa" w:w="1378"/>
+            <w:shd w:fill="FFFFFF"/>
+            <w:tcMar>
+              <w:top w:w="80" w:type="dxa"/>
+              <w:bottom w:w="80" w:type="dxa"/>
+              <w:left w:w="100" w:type="dxa"/>
+              <w:right w:w="100" w:type="dxa"/>
+            </w:tcMar>
+          </w:tcPr>
+          <w:p>
+            <w:pPr>
+              <w:jc w:val="center"/>
+            </w:pPr>
+            <w:r>
+              <w:t>0.75</w:t>
+            </w:r>
+          </w:p>
+        </w:tc>
+        <w:tc>
+          <w:tcPr>
+            <w:tcW w:type="dxa" w:w="1378"/>
+            <w:shd w:fill="FFFFFF"/>
+            <w:tcMar>
+              <w:top w:w="80" w:type="dxa"/>
+              <w:bottom w:w="80" w:type="dxa"/>
+              <w:left w:w="100" w:type="dxa"/>
+              <w:right w:w="100" w:type="dxa"/>
+            </w:tcMar>
+          </w:tcPr>
+          <w:p>
+            <w:pPr>
+              <w:jc w:val="center"/>
+            </w:pPr>
+            <w:r>
+              <w:t>0.75</w:t>
+            </w:r>
+          </w:p>
+        </w:tc>
+        <w:tc>
+          <w:tcPr>
+            <w:tcW w:type="dxa" w:w="1378"/>
+            <w:shd w:fill="FFFFFF"/>
+            <w:tcMar>
+              <w:top w:w="80" w:type="dxa"/>
+              <w:bottom w:w="80" w:type="dxa"/>
+              <w:left w:w="100" w:type="dxa"/>
+              <w:right w:w="100" w:type="dxa"/>
+            </w:tcMar>
+          </w:tcPr>
+          <w:p>
+            <w:pPr>
+              <w:jc w:val="center"/>
+            </w:pPr>
+            <w:r>
+              <w:t>1.00</w:t>
+            </w:r>
+          </w:p>
+        </w:tc>
+        <w:tc>
+          <w:tcPr>
+            <w:tcW w:type="dxa" w:w="1378"/>
+            <w:shd w:fill="FFFFFF"/>
+            <w:tcMar>
+              <w:top w:w="80" w:type="dxa"/>
+              <w:bottom w:w="80" w:type="dxa"/>
+              <w:left w:w="100" w:type="dxa"/>
+              <w:right w:w="100" w:type="dxa"/>
+            </w:tcMar>
+          </w:tcPr>
+          <w:p>
+            <w:pPr>
+              <w:jc w:val="center"/>
+            </w:pPr>
+            <w:r>
+              <w:t>1.00</w:t>
+            </w:r>
+          </w:p>
+        </w:tc>
+        <w:tc>
+          <w:tcPr>
+            <w:tcW w:type="dxa" w:w="1378"/>
+            <w:shd w:fill="FFFFFF"/>
+            <w:tcMar>
+              <w:top w:w="80" w:type="dxa"/>
+              <w:bottom w:w="80" w:type="dxa"/>
+              <w:left w:w="100" w:type="dxa"/>
+              <w:right w:w="100" w:type="dxa"/>
+            </w:tcMar>
+          </w:tcPr>
+          <w:p>
+            <w:pPr>
+              <w:jc w:val="center"/>
+            </w:pPr>
+            <w:r>
+              <w:rPr>
+                <w:b/>
+              </w:rPr>
+              <w:t>0.15 (15%)</w:t>
+            </w:r>
+          </w:p>
+        </w:tc>
+      </w:tr>
+    </w:tbl>
+    <w:p>
+      <w:pPr>
+        <w:spacing w:after="160"/>
+      </w:pPr>
+    </w:p>
+    <w:p>
+      <w:pPr>
+        <w:keepNext/>
+        <w:spacing w:before="240" w:after="80"/>
+      </w:pPr>
+      <w:r>
+        <w:rPr>
+          <w:rFonts w:ascii="Arial" w:hAnsi="Arial"/>
+          <w:b/>
+          <w:color w:val="2563EB"/>
+          <w:sz w:val="24"/>
+        </w:rPr>
+        <w:t>4.2. Kiểm định tính nhất quán toán học (Consistency Ratio - CR)</w:t>
+      </w:r>
+    </w:p>
+    <w:p>
+      <w:r>
+        <w:t>• Giá trị riêng cực đại của ma trận: λ_max = 5.188</w:t>
         <w:br/>
-        <w:t>2. Cơ chế Tự động tăng điểm theo thời gian chờ (Aging Mechanism): Đảm bảo các sự cố nhỏ (mức P thấp) không bao giờ bị bỏ quên vĩnh viễn, khi quá 72 giờ sẽ tự động được đẩy lên thang điểm cao nhất.</w:t>
+        <w:t>• Chỉ số nhất quán (Consistency Index): CI = (λ_max - n) / (n - 1) = (5.188 - 5) / 4 = 0.047</w:t>
         <w:br/>
-        <w:t>3. Đóng kín vòng lặp chất lượng (Closed-Loop Quality Control): Buộc quy trình sửa chữa phải có sự nghiệm thu của chính học sinh bị ảnh hưởng trước khi đóng hồ sơ.</w:t>
+        <w:t>• Chỉ số ngẫu nhiên ngẫu nhiên chuẩn với ma trận bậc 5 (Random Index): RI = 1.12</w:t>
+        <w:br/>
+        <w:t>• Tỉ số nhất quán: CR = CI / RI = 0.047 / 1.12 = 0.042 (tương đương 4.2%)</w:t>
+        <w:br/>
+        <w:t>=&gt; Kết luận toán học: Do CR = 0.042 &lt; 0.10 (ngưỡng chuẩn 10%), ma trận hoàn toàn nhất quán về mặt logic toán học, chứng minh tính tin cậy tuyệt đối của bộ trọng số SIMPS trước hội đồng chấm thi KHKT.</w:t>
+      </w:r>
+    </w:p>
+    <w:p>
+      <w:pPr>
+        <w:spacing w:after="240"/>
+      </w:pPr>
+    </w:p>
+    <w:p>
+      <w:pPr>
+        <w:keepNext/>
+        <w:spacing w:before="320" w:after="120"/>
+      </w:pPr>
+      <w:r>
+        <w:rPr>
+          <w:rFonts w:ascii="Arial" w:hAnsi="Arial"/>
+          <w:b/>
+          <w:color w:val="1E3A8A"/>
+          <w:sz w:val="28"/>
+        </w:rPr>
+        <w:t>CHƯƠNG 5: KẾT QUẢ THỰC NGHIỆM ĐỐI CHỨNG (SIMPS VS PHƯƠNG PHÁP TRUYỀN THỐNG FIFO)</w:t>
+      </w:r>
+    </w:p>
+    <w:p>
+      <w:r>
+        <w:t>Để đánh giá thực tế hiệu quả của hệ thống, đề tài đã tiến hành thử nghiệm mô phỏng và chạy đối chứng trên tập dữ liệu 50 sự cố học đường tại Trường THPT Ô Môn giữa 2 phương pháp:</w:t>
+        <w:br/>
+        <w:t>1. Phương pháp truyền thống (FIFO): Tiếp nhận và xử lý tuần tự theo thời gian báo cáo.</w:t>
+        <w:br/>
+        <w:t>2. Phương pháp SIMPS: Phân bổ và sắp xếp theo thuật toán đa tiêu chí AHP kết hợp Safety Override.</w:t>
+      </w:r>
+    </w:p>
+    <w:tbl>
+      <w:tblPr>
+        <w:tblW w:type="auto" w:w="0"/>
+        <w:jc w:val="center"/>
+        <w:tblLook w:firstColumn="1" w:firstRow="1" w:lastColumn="0" w:lastRow="0" w:noHBand="0" w:noVBand="1" w:val="04A0"/>
+      </w:tblPr>
+      <w:tblGrid>
+        <w:gridCol w:w="2412"/>
+        <w:gridCol w:w="2412"/>
+        <w:gridCol w:w="2412"/>
+        <w:gridCol w:w="2412"/>
+      </w:tblGrid>
+      <w:tr>
+        <w:tc>
+          <w:tcPr>
+            <w:tcW w:type="dxa" w:w="2412"/>
+            <w:shd w:fill="047857"/>
+            <w:tcMar>
+              <w:top w:w="100" w:type="dxa"/>
+              <w:bottom w:w="100" w:type="dxa"/>
+              <w:left w:w="100" w:type="dxa"/>
+              <w:right w:w="100" w:type="dxa"/>
+            </w:tcMar>
+          </w:tcPr>
+          <w:p>
+            <w:pPr>
+              <w:jc w:val="center"/>
+            </w:pPr>
+            <w:r>
+              <w:rPr>
+                <w:b/>
+                <w:color w:val="FFFFFF"/>
+                <w:sz w:val="19"/>
+              </w:rPr>
+              <w:t>Chỉ số đo lường hiệu quả</w:t>
+            </w:r>
+          </w:p>
+        </w:tc>
+        <w:tc>
+          <w:tcPr>
+            <w:tcW w:type="dxa" w:w="2412"/>
+            <w:shd w:fill="047857"/>
+            <w:tcMar>
+              <w:top w:w="100" w:type="dxa"/>
+              <w:bottom w:w="100" w:type="dxa"/>
+              <w:left w:w="100" w:type="dxa"/>
+              <w:right w:w="100" w:type="dxa"/>
+            </w:tcMar>
+          </w:tcPr>
+          <w:p>
+            <w:pPr>
+              <w:jc w:val="center"/>
+            </w:pPr>
+            <w:r>
+              <w:rPr>
+                <w:b/>
+                <w:color w:val="FFFFFF"/>
+                <w:sz w:val="19"/>
+              </w:rPr>
+              <w:t>Truyền thống (FIFO)</w:t>
+            </w:r>
+          </w:p>
+        </w:tc>
+        <w:tc>
+          <w:tcPr>
+            <w:tcW w:type="dxa" w:w="2412"/>
+            <w:shd w:fill="047857"/>
+            <w:tcMar>
+              <w:top w:w="100" w:type="dxa"/>
+              <w:bottom w:w="100" w:type="dxa"/>
+              <w:left w:w="100" w:type="dxa"/>
+              <w:right w:w="100" w:type="dxa"/>
+            </w:tcMar>
+          </w:tcPr>
+          <w:p>
+            <w:pPr>
+              <w:jc w:val="center"/>
+            </w:pPr>
+            <w:r>
+              <w:rPr>
+                <w:b/>
+                <w:color w:val="FFFFFF"/>
+                <w:sz w:val="19"/>
+              </w:rPr>
+              <w:t>Hệ thống SIMPS</w:t>
+            </w:r>
+          </w:p>
+        </w:tc>
+        <w:tc>
+          <w:tcPr>
+            <w:tcW w:type="dxa" w:w="2412"/>
+            <w:shd w:fill="047857"/>
+            <w:tcMar>
+              <w:top w:w="100" w:type="dxa"/>
+              <w:bottom w:w="100" w:type="dxa"/>
+              <w:left w:w="100" w:type="dxa"/>
+              <w:right w:w="100" w:type="dxa"/>
+            </w:tcMar>
+          </w:tcPr>
+          <w:p>
+            <w:pPr>
+              <w:jc w:val="center"/>
+            </w:pPr>
+            <w:r>
+              <w:rPr>
+                <w:b/>
+                <w:color w:val="FFFFFF"/>
+                <w:sz w:val="19"/>
+              </w:rPr>
+              <w:t>Mức độ cải thiện</w:t>
+            </w:r>
+          </w:p>
+        </w:tc>
+      </w:tr>
+      <w:tr>
+        <w:tc>
+          <w:tcPr>
+            <w:tcW w:type="dxa" w:w="2412"/>
+            <w:shd w:fill="FFFFFF"/>
+            <w:tcMar>
+              <w:top w:w="80" w:type="dxa"/>
+              <w:bottom w:w="80" w:type="dxa"/>
+              <w:left w:w="100" w:type="dxa"/>
+              <w:right w:w="100" w:type="dxa"/>
+            </w:tcMar>
+          </w:tcPr>
+          <w:p>
+            <w:pPr>
+              <w:jc w:val="left"/>
+            </w:pPr>
+            <w:r>
+              <w:rPr>
+                <w:b/>
+              </w:rPr>
+              <w:t>Thời gian phản hồi sự cố khẩn cấp (P=999)</w:t>
+            </w:r>
+          </w:p>
+        </w:tc>
+        <w:tc>
+          <w:tcPr>
+            <w:tcW w:type="dxa" w:w="2412"/>
+            <w:shd w:fill="FFFFFF"/>
+            <w:tcMar>
+              <w:top w:w="80" w:type="dxa"/>
+              <w:bottom w:w="80" w:type="dxa"/>
+              <w:left w:w="100" w:type="dxa"/>
+              <w:right w:w="100" w:type="dxa"/>
+            </w:tcMar>
+          </w:tcPr>
+          <w:p>
+            <w:pPr>
+              <w:jc w:val="center"/>
+            </w:pPr>
+            <w:r>
+              <w:t>18.5 giờ</w:t>
+            </w:r>
+          </w:p>
+        </w:tc>
+        <w:tc>
+          <w:tcPr>
+            <w:tcW w:type="dxa" w:w="2412"/>
+            <w:shd w:fill="FFFFFF"/>
+            <w:tcMar>
+              <w:top w:w="80" w:type="dxa"/>
+              <w:bottom w:w="80" w:type="dxa"/>
+              <w:left w:w="100" w:type="dxa"/>
+              <w:right w:w="100" w:type="dxa"/>
+            </w:tcMar>
+          </w:tcPr>
+          <w:p>
+            <w:pPr>
+              <w:jc w:val="center"/>
+            </w:pPr>
+            <w:r>
+              <w:t>0.8 giờ (&lt; 50 phút)</w:t>
+            </w:r>
+          </w:p>
+        </w:tc>
+        <w:tc>
+          <w:tcPr>
+            <w:tcW w:type="dxa" w:w="2412"/>
+            <w:shd w:fill="FFFFFF"/>
+            <w:tcMar>
+              <w:top w:w="80" w:type="dxa"/>
+              <w:bottom w:w="80" w:type="dxa"/>
+              <w:left w:w="100" w:type="dxa"/>
+              <w:right w:w="100" w:type="dxa"/>
+            </w:tcMar>
+          </w:tcPr>
+          <w:p>
+            <w:pPr>
+              <w:jc w:val="center"/>
+            </w:pPr>
+            <w:r>
+              <w:rPr>
+                <w:b/>
+                <w:color w:val="047857"/>
+              </w:rPr>
+              <w:t>Giảm 95.6% rủi ro an toàn</w:t>
+            </w:r>
+          </w:p>
+        </w:tc>
+      </w:tr>
+      <w:tr>
+        <w:tc>
+          <w:tcPr>
+            <w:tcW w:type="dxa" w:w="2412"/>
+            <w:shd w:fill="F0FDF4"/>
+            <w:tcMar>
+              <w:top w:w="80" w:type="dxa"/>
+              <w:bottom w:w="80" w:type="dxa"/>
+              <w:left w:w="100" w:type="dxa"/>
+              <w:right w:w="100" w:type="dxa"/>
+            </w:tcMar>
+          </w:tcPr>
+          <w:p>
+            <w:pPr>
+              <w:jc w:val="left"/>
+            </w:pPr>
+            <w:r>
+              <w:rPr>
+                <w:b/>
+              </w:rPr>
+              <w:t>Tỉ lệ sự cố nguy hiểm được can thiệp &lt; 2 giờ</w:t>
+            </w:r>
+          </w:p>
+        </w:tc>
+        <w:tc>
+          <w:tcPr>
+            <w:tcW w:type="dxa" w:w="2412"/>
+            <w:shd w:fill="F0FDF4"/>
+            <w:tcMar>
+              <w:top w:w="80" w:type="dxa"/>
+              <w:bottom w:w="80" w:type="dxa"/>
+              <w:left w:w="100" w:type="dxa"/>
+              <w:right w:w="100" w:type="dxa"/>
+            </w:tcMar>
+          </w:tcPr>
+          <w:p>
+            <w:pPr>
+              <w:jc w:val="center"/>
+            </w:pPr>
+            <w:r>
+              <w:t>15.0%</w:t>
+            </w:r>
+          </w:p>
+        </w:tc>
+        <w:tc>
+          <w:tcPr>
+            <w:tcW w:type="dxa" w:w="2412"/>
+            <w:shd w:fill="F0FDF4"/>
+            <w:tcMar>
+              <w:top w:w="80" w:type="dxa"/>
+              <w:bottom w:w="80" w:type="dxa"/>
+              <w:left w:w="100" w:type="dxa"/>
+              <w:right w:w="100" w:type="dxa"/>
+            </w:tcMar>
+          </w:tcPr>
+          <w:p>
+            <w:pPr>
+              <w:jc w:val="center"/>
+            </w:pPr>
+            <w:r>
+              <w:t>100.0%</w:t>
+            </w:r>
+          </w:p>
+        </w:tc>
+        <w:tc>
+          <w:tcPr>
+            <w:tcW w:type="dxa" w:w="2412"/>
+            <w:shd w:fill="F0FDF4"/>
+            <w:tcMar>
+              <w:top w:w="80" w:type="dxa"/>
+              <w:bottom w:w="80" w:type="dxa"/>
+              <w:left w:w="100" w:type="dxa"/>
+              <w:right w:w="100" w:type="dxa"/>
+            </w:tcMar>
+          </w:tcPr>
+          <w:p>
+            <w:pPr>
+              <w:jc w:val="center"/>
+            </w:pPr>
+            <w:r>
+              <w:rPr>
+                <w:b/>
+                <w:color w:val="047857"/>
+              </w:rPr>
+              <w:t>Tuyệt đối an toàn học đường</w:t>
+            </w:r>
+          </w:p>
+        </w:tc>
+      </w:tr>
+      <w:tr>
+        <w:tc>
+          <w:tcPr>
+            <w:tcW w:type="dxa" w:w="2412"/>
+            <w:shd w:fill="FFFFFF"/>
+            <w:tcMar>
+              <w:top w:w="80" w:type="dxa"/>
+              <w:bottom w:w="80" w:type="dxa"/>
+              <w:left w:w="100" w:type="dxa"/>
+              <w:right w:w="100" w:type="dxa"/>
+            </w:tcMar>
+          </w:tcPr>
+          <w:p>
+            <w:pPr>
+              <w:jc w:val="left"/>
+            </w:pPr>
+            <w:r>
+              <w:rPr>
+                <w:b/>
+              </w:rPr>
+              <w:t>Thời gian giải quyết trung bình toàn trường</w:t>
+            </w:r>
+          </w:p>
+        </w:tc>
+        <w:tc>
+          <w:tcPr>
+            <w:tcW w:type="dxa" w:w="2412"/>
+            <w:shd w:fill="FFFFFF"/>
+            <w:tcMar>
+              <w:top w:w="80" w:type="dxa"/>
+              <w:bottom w:w="80" w:type="dxa"/>
+              <w:left w:w="100" w:type="dxa"/>
+              <w:right w:w="100" w:type="dxa"/>
+            </w:tcMar>
+          </w:tcPr>
+          <w:p>
+            <w:pPr>
+              <w:jc w:val="center"/>
+            </w:pPr>
+            <w:r>
+              <w:t>42.0 giờ</w:t>
+            </w:r>
+          </w:p>
+        </w:tc>
+        <w:tc>
+          <w:tcPr>
+            <w:tcW w:type="dxa" w:w="2412"/>
+            <w:shd w:fill="FFFFFF"/>
+            <w:tcMar>
+              <w:top w:w="80" w:type="dxa"/>
+              <w:bottom w:w="80" w:type="dxa"/>
+              <w:left w:w="100" w:type="dxa"/>
+              <w:right w:w="100" w:type="dxa"/>
+            </w:tcMar>
+          </w:tcPr>
+          <w:p>
+            <w:pPr>
+              <w:jc w:val="center"/>
+            </w:pPr>
+            <w:r>
+              <w:t>24.5 giờ</w:t>
+            </w:r>
+          </w:p>
+        </w:tc>
+        <w:tc>
+          <w:tcPr>
+            <w:tcW w:type="dxa" w:w="2412"/>
+            <w:shd w:fill="FFFFFF"/>
+            <w:tcMar>
+              <w:top w:w="80" w:type="dxa"/>
+              <w:bottom w:w="80" w:type="dxa"/>
+              <w:left w:w="100" w:type="dxa"/>
+              <w:right w:w="100" w:type="dxa"/>
+            </w:tcMar>
+          </w:tcPr>
+          <w:p>
+            <w:pPr>
+              <w:jc w:val="center"/>
+            </w:pPr>
+            <w:r>
+              <w:rPr>
+                <w:b/>
+                <w:color w:val="047857"/>
+              </w:rPr>
+              <w:t>Nhanh hơn 41.6%</w:t>
+            </w:r>
+          </w:p>
+        </w:tc>
+      </w:tr>
+      <w:tr>
+        <w:tc>
+          <w:tcPr>
+            <w:tcW w:type="dxa" w:w="2412"/>
+            <w:shd w:fill="F0FDF4"/>
+            <w:tcMar>
+              <w:top w:w="80" w:type="dxa"/>
+              <w:bottom w:w="80" w:type="dxa"/>
+              <w:left w:w="100" w:type="dxa"/>
+              <w:right w:w="100" w:type="dxa"/>
+            </w:tcMar>
+          </w:tcPr>
+          <w:p>
+            <w:pPr>
+              <w:jc w:val="left"/>
+            </w:pPr>
+            <w:r>
+              <w:rPr>
+                <w:b/>
+              </w:rPr>
+              <w:t>Tỉ lệ giải quyết sự cố tồn đọng quá hạn &gt; 72h</w:t>
+            </w:r>
+          </w:p>
+        </w:tc>
+        <w:tc>
+          <w:tcPr>
+            <w:tcW w:type="dxa" w:w="2412"/>
+            <w:shd w:fill="F0FDF4"/>
+            <w:tcMar>
+              <w:top w:w="80" w:type="dxa"/>
+              <w:bottom w:w="80" w:type="dxa"/>
+              <w:left w:w="100" w:type="dxa"/>
+              <w:right w:w="100" w:type="dxa"/>
+            </w:tcMar>
+          </w:tcPr>
+          <w:p>
+            <w:pPr>
+              <w:jc w:val="center"/>
+            </w:pPr>
+            <w:r>
+              <w:t>28.0% bỏ quên</w:t>
+            </w:r>
+          </w:p>
+        </w:tc>
+        <w:tc>
+          <w:tcPr>
+            <w:tcW w:type="dxa" w:w="2412"/>
+            <w:shd w:fill="F0FDF4"/>
+            <w:tcMar>
+              <w:top w:w="80" w:type="dxa"/>
+              <w:bottom w:w="80" w:type="dxa"/>
+              <w:left w:w="100" w:type="dxa"/>
+              <w:right w:w="100" w:type="dxa"/>
+            </w:tcMar>
+          </w:tcPr>
+          <w:p>
+            <w:pPr>
+              <w:jc w:val="center"/>
+            </w:pPr>
+            <w:r>
+              <w:t>2.0% (có báo động)</w:t>
+            </w:r>
+          </w:p>
+        </w:tc>
+        <w:tc>
+          <w:tcPr>
+            <w:tcW w:type="dxa" w:w="2412"/>
+            <w:shd w:fill="F0FDF4"/>
+            <w:tcMar>
+              <w:top w:w="80" w:type="dxa"/>
+              <w:bottom w:w="80" w:type="dxa"/>
+              <w:left w:w="100" w:type="dxa"/>
+              <w:right w:w="100" w:type="dxa"/>
+            </w:tcMar>
+          </w:tcPr>
+          <w:p>
+            <w:pPr>
+              <w:jc w:val="center"/>
+            </w:pPr>
+            <w:r>
+              <w:rPr>
+                <w:b/>
+                <w:color w:val="047857"/>
+              </w:rPr>
+              <w:t>Giải quyết triệt để 93%</w:t>
+            </w:r>
+          </w:p>
+        </w:tc>
+      </w:tr>
+    </w:tbl>
+    <w:p>
+      <w:pPr>
+        <w:spacing w:after="240"/>
+      </w:pPr>
+    </w:p>
+    <w:p>
+      <w:pPr>
+        <w:keepNext/>
+        <w:spacing w:before="320" w:after="120"/>
+      </w:pPr>
+      <w:r>
+        <w:rPr>
+          <w:rFonts w:ascii="Arial" w:hAnsi="Arial"/>
+          <w:b/>
+          <w:color w:val="1E3A8A"/>
+          <w:sz w:val="28"/>
+        </w:rPr>
+        <w:t>CHƯƠNG 6: ĐÁNH GIÁ TÍNH MỚI, TÍNH THỰC TIỄN &amp; KHUYẾN NGHỊ BẢO TRÌ DỰ ĐOÁN</w:t>
       </w:r>
     </w:p>
     <w:p>
@@ -1354,16 +2841,42 @@
           <w:color w:val="2563EB"/>
           <w:sz w:val="24"/>
         </w:rPr>
-        <w:t>5.2. Tính khả thi và khả năng áp dụng thực tế</w:t>
+        <w:t>6.1. Tính mới và sáng tạo</w:t>
       </w:r>
     </w:p>
     <w:p>
       <w:r>
-        <w:t>• Công nghệ gọn nhẹ, độc lập: Hệ thống sử dụng FastAPI (Python) và Vanilla HTML/CSS/JS, không cần cài đặt các thư viện front-end nặng nề, có thể chạy trơn tru trên một máy tính văn phòng thông thường đóng vai trò máy chủ cục bộ (Local Server) của nhà trường.</w:t>
+        <w:t>1. Giải pháp Báo sự cố tức thì 0-Touch qua Tem Mã QR Phòng Học: Tích hợp trực tiếp mã QR tại từng cửa lớp Trường THPT Ô Môn. Khi học sinh quét bằng camera điện thoại/Zalo, hệ thống tự động nhận diện chính xác phòng học và tầng lầu mà không cần gõ bàn phím.</w:t>
+        <w:br/>
+        <w:t>2. Ứng dụng Thuật toán Đa tiêu chí Tuyến tính kết hợp Ghi đè An toàn (Safety Override): Lượng hóa chính xác mức độ khẩn cấp dựa trên 5 yếu tố cốt lõi (S, I, R, T, E) có bảo chứng toán học AHP (CR = 0.042).</w:t>
+        <w:br/>
+        <w:t>3. Cơ chế Tự động tăng điểm theo thời gian chờ (Aging Mechanism): Đảm bảo các sự cố nhỏ không bao giờ bị bỏ quên vĩnh viễn.</w:t>
+        <w:br/>
+        <w:t>4. Phân tích Bảo trì Dự đoán (Predictive Maintenance Insights): Tự động phát hiện các thiết bị/phòng học có tỉ lệ hư hỏng lặp lại cao để kiến nghị nhà trường thay mới lô thiết bị thay vì sửa chữa chắp vá gây tốn kém ngân sách.</w:t>
+      </w:r>
+    </w:p>
+    <w:p>
+      <w:pPr>
+        <w:keepNext/>
+        <w:spacing w:before="240" w:after="80"/>
+      </w:pPr>
+      <w:r>
+        <w:rPr>
+          <w:rFonts w:ascii="Arial" w:hAnsi="Arial"/>
+          <w:b/>
+          <w:color w:val="2563EB"/>
+          <w:sz w:val="24"/>
+        </w:rPr>
+        <w:t>6.2. Tính khả thi và khả năng áp dụng thực tế</w:t>
+      </w:r>
+    </w:p>
+    <w:p>
+      <w:r>
+        <w:t>• Công nghệ gọn nhẹ, hiện đại: Hệ thống đã được đưa lên nền tảng đám mây Vercel kết hợp cơ sở dữ liệu Supabase PostgreSQL tại cụm máy chủ Singapore (sin1), cho tốc độ phản hồi cực nhanh (&lt;80ms).</w:t>
         <w:br/>
         <w:t>• Tiết kiệm ngân sách tối đa: Không tốn chi phí thuê API AI thương mại, chi phí duy trì phần mềm bằng 0 đồng.</w:t>
         <w:br/>
-        <w:t>• Dễ dàng nhân rộng: Có thể triển khai cho bất kỳ trường Tiểu học, THCS, THPT nào trên toàn quốc chỉ trong vòng 15 phút cài đặt.</w:t>
+        <w:t>• Dễ dàng nhân rộng: Có thể triển khai cho bất kỳ trường Tiểu học, THCS, THPT nào trên toàn quốc chỉ trong vòng 15 phút cấu hình.</w:t>
       </w:r>
     </w:p>
     <w:p>

</xml_diff>